<commit_message>
added Bou... deRidder files in DelabastitaRubens
</commit_message>
<xml_diff>
--- a/posts/DelabastitaRubens/DelabastitaRubens.docx
+++ b/posts/DelabastitaRubens/DelabastitaRubens.docx
@@ -42,7 +42,7 @@
         <w:pStyle w:val="Date"/>
       </w:pPr>
       <w:r>
-        <w:t xml:space="preserve">June 17, 2025, 09:06 +0900</w:t>
+        <w:t xml:space="preserve">September 26, 2025, 16:09 +0900</w:t>
       </w:r>
     </w:p>
     <w:p>
@@ -314,13 +314,13 @@
       </w:r>
     </w:p>
     <w:bookmarkEnd w:id="27"/>
-    <w:bookmarkStart w:id="33" w:name="why-the-wage-markdown-matters"/>
+    <w:bookmarkStart w:id="28" w:name="research-design"/>
     <w:p>
       <w:pPr>
         <w:pStyle w:val="Heading2"/>
       </w:pPr>
       <w:r>
-        <w:t xml:space="preserve">Why the wage markdown matters</w:t>
+        <w:t xml:space="preserve">Research design</w:t>
       </w:r>
     </w:p>
     <w:p>
@@ -332,7 +332,7 @@
         </w:numPr>
       </w:pPr>
       <w:r>
-        <w:t xml:space="preserve">Intrinsic interest: Is labour exploited?</w:t>
+        <w:t xml:space="preserve">The turn of 20th century Belgium where output price cartel was legal</w:t>
       </w:r>
     </w:p>
     <w:p>
@@ -344,7 +344,7 @@
         </w:numPr>
       </w:pPr>
       <w:r>
-        <w:t xml:space="preserve">Analytical interest:</w:t>
+        <w:t xml:space="preserve">Derived a mapping: degree of wage collusion → parameter estimates</w:t>
       </w:r>
     </w:p>
     <w:p>
@@ -356,25 +356,7 @@
         </w:numPr>
       </w:pPr>
       <w:r>
-        <w:t xml:space="preserve">How big is the welfare (deadweight) loss?</w:t>
-      </w:r>
-    </w:p>
-    <w:p>
-      <w:pPr>
-        <w:pStyle w:val="Compact"/>
-        <w:numPr>
-          <w:ilvl w:val="1"/>
-          <w:numId w:val="1003"/>
-        </w:numPr>
-      </w:pPr>
-      <w:r>
-        <w:t xml:space="preserve">Markdown↑, markups↑ ⇒ TFP↓, inflation↑</w:t>
-      </w:r>
-      <w:r>
-        <w:rPr>
-          <w:rStyle w:val="FootnoteReference"/>
-        </w:rPr>
-        <w:footnoteReference w:id="28"/>
+        <w:t xml:space="preserve">OLS: Estimated wage markdown on estimated labor supply elasticity</w:t>
       </w:r>
     </w:p>
     <w:p>
@@ -386,7 +368,19 @@
         </w:numPr>
       </w:pPr>
       <w:r>
-        <w:t xml:space="preserve">Need to look at both ends: An exploited (from steel plants, railways) needs to be an exploiter (coal mine)</w:t>
+        <w:t xml:space="preserve">Production approach to wage markdown using revenue and factor quantity data</w:t>
+      </w:r>
+    </w:p>
+    <w:p>
+      <w:pPr>
+        <w:pStyle w:val="Compact"/>
+        <w:numPr>
+          <w:ilvl w:val="1"/>
+          <w:numId w:val="1004"/>
+        </w:numPr>
+      </w:pPr>
+      <w:r>
+        <w:t xml:space="preserve">Data: Digitised from historical firm records</w:t>
       </w:r>
     </w:p>
     <w:p>
@@ -395,6 +389,914 @@
         <w:numPr>
           <w:ilvl w:val="0"/>
           <w:numId w:val="1002"/>
+        </w:numPr>
+      </w:pPr>
+      <w:r>
+        <w:t xml:space="preserve">Production parameters</w:t>
+      </w:r>
+    </w:p>
+    <w:p>
+      <w:pPr>
+        <w:pStyle w:val="Compact"/>
+        <w:numPr>
+          <w:ilvl w:val="1"/>
+          <w:numId w:val="1005"/>
+        </w:numPr>
+      </w:pPr>
+      <w:r>
+        <w:t xml:space="preserve">AR(1) in productivity</w:t>
+      </w:r>
+      <w:r>
+        <w:t xml:space="preserve"> </w:t>
+      </w:r>
+      <m:oMath>
+        <m:sSub>
+          <m:e>
+            <m:r>
+              <m:t>ω</m:t>
+            </m:r>
+          </m:e>
+          <m:sub>
+            <m:r>
+              <m:t>t</m:t>
+            </m:r>
+          </m:sub>
+        </m:sSub>
+        <m:r>
+          <m:rPr>
+            <m:sty m:val="p"/>
+          </m:rPr>
+          <m:t>=</m:t>
+        </m:r>
+        <m:r>
+          <m:t>ρ</m:t>
+        </m:r>
+        <m:sSub>
+          <m:e>
+            <m:r>
+              <m:t>ω</m:t>
+            </m:r>
+          </m:e>
+          <m:sub>
+            <m:r>
+              <m:t>t</m:t>
+            </m:r>
+            <m:r>
+              <m:rPr>
+                <m:sty m:val="p"/>
+              </m:rPr>
+              <m:t>−</m:t>
+            </m:r>
+            <m:r>
+              <m:t>1</m:t>
+            </m:r>
+          </m:sub>
+        </m:sSub>
+        <m:r>
+          <m:rPr>
+            <m:sty m:val="p"/>
+          </m:rPr>
+          <m:t>+</m:t>
+        </m:r>
+        <m:sSub>
+          <m:e>
+            <m:r>
+              <m:t>ν</m:t>
+            </m:r>
+          </m:e>
+          <m:sub>
+            <m:r>
+              <m:t>t</m:t>
+            </m:r>
+          </m:sub>
+        </m:sSub>
+      </m:oMath>
+      <w:r>
+        <w:t xml:space="preserve"> </w:t>
+      </w:r>
+      <w:r>
+        <w:t xml:space="preserve">so productivity shock</w:t>
+      </w:r>
+      <w:r>
+        <w:t xml:space="preserve"> </w:t>
+      </w:r>
+      <m:oMath>
+        <m:sSub>
+          <m:e>
+            <m:r>
+              <m:t>ν</m:t>
+            </m:r>
+          </m:e>
+          <m:sub>
+            <m:r>
+              <m:t>t</m:t>
+            </m:r>
+          </m:sub>
+        </m:sSub>
+      </m:oMath>
+      <w:r>
+        <w:t xml:space="preserve"> </w:t>
+      </w:r>
+      <w:r>
+        <w:t xml:space="preserve">is orthogonal to</w:t>
+      </w:r>
+      <w:r>
+        <w:t xml:space="preserve"> </w:t>
+      </w:r>
+      <m:oMath>
+        <m:sSub>
+          <m:e>
+            <m:r>
+              <m:t>k</m:t>
+            </m:r>
+          </m:e>
+          <m:sub>
+            <m:r>
+              <m:t>r</m:t>
+            </m:r>
+          </m:sub>
+        </m:sSub>
+        <m:r>
+          <m:rPr>
+            <m:sty m:val="p"/>
+          </m:rPr>
+          <m:t>,</m:t>
+        </m:r>
+        <m:sSub>
+          <m:e>
+            <m:r>
+              <m:t>k</m:t>
+            </m:r>
+          </m:e>
+          <m:sub>
+            <m:r>
+              <m:t>r</m:t>
+            </m:r>
+            <m:r>
+              <m:rPr>
+                <m:sty m:val="p"/>
+              </m:rPr>
+              <m:t>−</m:t>
+            </m:r>
+            <m:r>
+              <m:t>1</m:t>
+            </m:r>
+          </m:sub>
+        </m:sSub>
+        <m:r>
+          <m:rPr>
+            <m:sty m:val="p"/>
+          </m:rPr>
+          <m:t>,</m:t>
+        </m:r>
+        <m:sSub>
+          <m:e>
+            <m:r>
+              <m:t>l</m:t>
+            </m:r>
+          </m:e>
+          <m:sub>
+            <m:r>
+              <m:t>r</m:t>
+            </m:r>
+            <m:r>
+              <m:rPr>
+                <m:sty m:val="p"/>
+              </m:rPr>
+              <m:t>−</m:t>
+            </m:r>
+            <m:r>
+              <m:t>1</m:t>
+            </m:r>
+          </m:sub>
+        </m:sSub>
+        <m:r>
+          <m:rPr>
+            <m:sty m:val="p"/>
+          </m:rPr>
+          <m:t>,</m:t>
+        </m:r>
+        <m:sSub>
+          <m:e>
+            <m:r>
+              <m:t>m</m:t>
+            </m:r>
+          </m:e>
+          <m:sub>
+            <m:r>
+              <m:t>r</m:t>
+            </m:r>
+            <m:r>
+              <m:rPr>
+                <m:sty m:val="p"/>
+              </m:rPr>
+              <m:t>−</m:t>
+            </m:r>
+            <m:r>
+              <m:t>1</m:t>
+            </m:r>
+          </m:sub>
+        </m:sSub>
+      </m:oMath>
+      <w:r>
+        <w:t xml:space="preserve"> </w:t>
+      </w:r>
+      <w:r>
+        <w:t xml:space="preserve">for</w:t>
+      </w:r>
+      <w:r>
+        <w:t xml:space="preserve"> </w:t>
+      </w:r>
+      <m:oMath>
+        <m:r>
+          <m:t>r</m:t>
+        </m:r>
+        <m:r>
+          <m:rPr>
+            <m:sty m:val="p"/>
+          </m:rPr>
+          <m:t>=</m:t>
+        </m:r>
+        <m:r>
+          <m:t>2</m:t>
+        </m:r>
+        <m:r>
+          <m:rPr>
+            <m:sty m:val="p"/>
+          </m:rPr>
+          <m:t>,</m:t>
+        </m:r>
+        <m:r>
+          <m:rPr>
+            <m:sty m:val="p"/>
+          </m:rPr>
+          <m:t>.</m:t>
+        </m:r>
+        <m:r>
+          <m:rPr>
+            <m:sty m:val="p"/>
+          </m:rPr>
+          <m:t>.</m:t>
+        </m:r>
+        <m:r>
+          <m:rPr>
+            <m:sty m:val="p"/>
+          </m:rPr>
+          <m:t>.</m:t>
+        </m:r>
+        <m:r>
+          <m:rPr>
+            <m:sty m:val="p"/>
+          </m:rPr>
+          <m:t>,</m:t>
+        </m:r>
+        <m:r>
+          <m:t>t</m:t>
+        </m:r>
+      </m:oMath>
+      <w:r>
+        <w:t xml:space="preserve">, which gives parameters</w:t>
+      </w:r>
+      <w:r>
+        <w:t xml:space="preserve"> </w:t>
+      </w:r>
+      <m:oMath>
+        <m:r>
+          <m:rPr>
+            <m:sty m:val="b"/>
+          </m:rPr>
+          <m:t>β</m:t>
+        </m:r>
+      </m:oMath>
+    </w:p>
+    <w:p>
+      <w:pPr>
+        <w:pStyle w:val="Compact"/>
+        <w:numPr>
+          <w:ilvl w:val="2"/>
+          <w:numId w:val="1006"/>
+        </w:numPr>
+      </w:pPr>
+      <w:r>
+        <w:t xml:space="preserve">Entry and exits need to be exogenous to</w:t>
+      </w:r>
+      <w:r>
+        <w:t xml:space="preserve"> </w:t>
+      </w:r>
+      <m:oMath>
+        <m:sSub>
+          <m:e>
+            <m:r>
+              <m:t>ω</m:t>
+            </m:r>
+          </m:e>
+          <m:sub>
+            <m:r>
+              <m:t>t</m:t>
+            </m:r>
+          </m:sub>
+        </m:sSub>
+      </m:oMath>
+      <w:r>
+        <w:t xml:space="preserve">: Endogenous entries/exits ⇒</w:t>
+      </w:r>
+    </w:p>
+    <w:p>
+      <w:pPr>
+        <w:pStyle w:val="Compact"/>
+        <w:numPr>
+          <w:ilvl w:val="3"/>
+          <w:numId w:val="1007"/>
+        </w:numPr>
+      </w:pPr>
+      <w:r>
+        <w:t xml:space="preserve">Lower</w:t>
+      </w:r>
+      <w:r>
+        <w:t xml:space="preserve"> </w:t>
+      </w:r>
+      <m:oMath>
+        <m:sSub>
+          <m:e>
+            <m:r>
+              <m:t>ω</m:t>
+            </m:r>
+          </m:e>
+          <m:sub>
+            <m:r>
+              <m:t>t</m:t>
+            </m:r>
+          </m:sub>
+        </m:sSub>
+      </m:oMath>
+      <w:r>
+        <w:t xml:space="preserve"> </w:t>
+      </w:r>
+      <w:r>
+        <w:t xml:space="preserve">exits and does not enter ⇒ positive sample selection</w:t>
+      </w:r>
+    </w:p>
+    <w:p>
+      <w:pPr>
+        <w:pStyle w:val="Compact"/>
+        <w:numPr>
+          <w:ilvl w:val="3"/>
+          <w:numId w:val="1007"/>
+        </w:numPr>
+      </w:pPr>
+      <w:r>
+        <w:t xml:space="preserve">Conditional on being in the data, firms with greater capital may not exit so easily even when</w:t>
+      </w:r>
+      <w:r>
+        <w:t xml:space="preserve"> </w:t>
+      </w:r>
+      <m:oMath>
+        <m:sSub>
+          <m:e>
+            <m:r>
+              <m:t>ω</m:t>
+            </m:r>
+          </m:e>
+          <m:sub>
+            <m:r>
+              <m:t>t</m:t>
+            </m:r>
+          </m:sub>
+        </m:sSub>
+      </m:oMath>
+      <w:r>
+        <w:t xml:space="preserve"> </w:t>
+      </w:r>
+      <w:r>
+        <w:t xml:space="preserve">is low, so negative correlations</w:t>
+      </w:r>
+    </w:p>
+    <w:p>
+      <w:pPr>
+        <w:pStyle w:val="Compact"/>
+        <w:numPr>
+          <w:ilvl w:val="2"/>
+          <w:numId w:val="1006"/>
+        </w:numPr>
+      </w:pPr>
+      <w:r>
+        <w:t xml:space="preserve">The use of unbalanced panel mitigates biases, so argued…</w:t>
+      </w:r>
+    </w:p>
+    <w:p>
+      <w:pPr>
+        <w:pStyle w:val="Compact"/>
+        <w:numPr>
+          <w:ilvl w:val="1"/>
+          <w:numId w:val="1005"/>
+        </w:numPr>
+      </w:pPr>
+      <w:r>
+        <w:t xml:space="preserve">GMM</w:t>
+      </w:r>
+      <w:r>
+        <w:t xml:space="preserve"> </w:t>
+      </w:r>
+      <m:oMath>
+        <m:r>
+          <m:t>E</m:t>
+        </m:r>
+        <m:d>
+          <m:dPr>
+            <m:begChr m:val="["/>
+            <m:sepChr m:val=""/>
+            <m:endChr m:val="]"/>
+            <m:grow/>
+          </m:dPr>
+          <m:e>
+            <m:sSub>
+              <m:e>
+                <m:r>
+                  <m:t>ω</m:t>
+                </m:r>
+              </m:e>
+              <m:sub>
+                <m:r>
+                  <m:t>t</m:t>
+                </m:r>
+              </m:sub>
+            </m:sSub>
+            <m:d>
+              <m:dPr>
+                <m:begChr m:val="("/>
+                <m:sepChr m:val=""/>
+                <m:endChr m:val=")"/>
+                <m:grow/>
+              </m:dPr>
+              <m:e>
+                <m:r>
+                  <m:rPr>
+                    <m:sty m:val="b"/>
+                  </m:rPr>
+                  <m:t>β</m:t>
+                </m:r>
+              </m:e>
+            </m:d>
+            <m:r>
+              <m:rPr>
+                <m:sty m:val="p"/>
+              </m:rPr>
+              <m:t>−</m:t>
+            </m:r>
+            <m:r>
+              <m:t>ρ</m:t>
+            </m:r>
+            <m:sSub>
+              <m:e>
+                <m:r>
+                  <m:t>ω</m:t>
+                </m:r>
+              </m:e>
+              <m:sub>
+                <m:r>
+                  <m:t>t</m:t>
+                </m:r>
+                <m:r>
+                  <m:rPr>
+                    <m:sty m:val="p"/>
+                  </m:rPr>
+                  <m:t>−</m:t>
+                </m:r>
+                <m:r>
+                  <m:t>1</m:t>
+                </m:r>
+              </m:sub>
+            </m:sSub>
+            <m:d>
+              <m:dPr>
+                <m:begChr m:val="("/>
+                <m:sepChr m:val=""/>
+                <m:endChr m:val=")"/>
+                <m:grow/>
+              </m:dPr>
+              <m:e>
+                <m:r>
+                  <m:rPr>
+                    <m:sty m:val="b"/>
+                  </m:rPr>
+                  <m:t>β</m:t>
+                </m:r>
+              </m:e>
+            </m:d>
+            <m:r>
+              <m:rPr>
+                <m:sty m:val="p"/>
+              </m:rPr>
+              <m:t>|</m:t>
+            </m:r>
+            <m:sSub>
+              <m:e>
+                <m:r>
+                  <m:t>l</m:t>
+                </m:r>
+              </m:e>
+              <m:sub>
+                <m:r>
+                  <m:t>t</m:t>
+                </m:r>
+                <m:r>
+                  <m:rPr>
+                    <m:sty m:val="p"/>
+                  </m:rPr>
+                  <m:t>−</m:t>
+                </m:r>
+                <m:r>
+                  <m:t>1</m:t>
+                </m:r>
+              </m:sub>
+            </m:sSub>
+            <m:r>
+              <m:rPr>
+                <m:sty m:val="p"/>
+              </m:rPr>
+              <m:t>,</m:t>
+            </m:r>
+            <m:sSub>
+              <m:e>
+                <m:r>
+                  <m:t>k</m:t>
+                </m:r>
+              </m:e>
+              <m:sub>
+                <m:r>
+                  <m:t>t</m:t>
+                </m:r>
+                <m:r>
+                  <m:rPr>
+                    <m:sty m:val="p"/>
+                  </m:rPr>
+                  <m:t>−</m:t>
+                </m:r>
+                <m:r>
+                  <m:t>1</m:t>
+                </m:r>
+              </m:sub>
+            </m:sSub>
+            <m:r>
+              <m:rPr>
+                <m:sty m:val="p"/>
+              </m:rPr>
+              <m:t>,</m:t>
+            </m:r>
+            <m:sSub>
+              <m:e>
+                <m:r>
+                  <m:t>k</m:t>
+                </m:r>
+              </m:e>
+              <m:sub>
+                <m:r>
+                  <m:t>t</m:t>
+                </m:r>
+              </m:sub>
+            </m:sSub>
+            <m:r>
+              <m:rPr>
+                <m:sty m:val="p"/>
+              </m:rPr>
+              <m:t>,</m:t>
+            </m:r>
+            <m:sSub>
+              <m:e>
+                <m:r>
+                  <m:t>m</m:t>
+                </m:r>
+              </m:e>
+              <m:sub>
+                <m:r>
+                  <m:t>t</m:t>
+                </m:r>
+                <m:r>
+                  <m:rPr>
+                    <m:sty m:val="p"/>
+                  </m:rPr>
+                  <m:t>−</m:t>
+                </m:r>
+                <m:r>
+                  <m:t>1</m:t>
+                </m:r>
+              </m:sub>
+            </m:sSub>
+            <m:r>
+              <m:rPr>
+                <m:sty m:val="p"/>
+              </m:rPr>
+              <m:t>,</m:t>
+            </m:r>
+            <m:sSub>
+              <m:e>
+                <m:r>
+                  <m:t>w</m:t>
+                </m:r>
+              </m:e>
+              <m:sub>
+                <m:r>
+                  <m:t>t</m:t>
+                </m:r>
+                <m:r>
+                  <m:rPr>
+                    <m:sty m:val="p"/>
+                  </m:rPr>
+                  <m:t>−</m:t>
+                </m:r>
+                <m:r>
+                  <m:t>1</m:t>
+                </m:r>
+              </m:sub>
+            </m:sSub>
+          </m:e>
+        </m:d>
+      </m:oMath>
+      <w:r>
+        <w:t xml:space="preserve"> </w:t>
+      </w:r>
+      <w:r>
+        <w:t xml:space="preserve">(</w:t>
+      </w:r>
+      <m:oMath>
+        <m:r>
+          <m:t>r</m:t>
+        </m:r>
+        <m:r>
+          <m:rPr>
+            <m:sty m:val="p"/>
+          </m:rPr>
+          <m:t>=</m:t>
+        </m:r>
+        <m:r>
+          <m:t>t</m:t>
+        </m:r>
+      </m:oMath>
+      <w:r>
+        <w:t xml:space="preserve"> </w:t>
+      </w:r>
+      <w:r>
+        <w:t xml:space="preserve">case)</w:t>
+      </w:r>
+    </w:p>
+    <w:p>
+      <w:pPr>
+        <w:pStyle w:val="Compact"/>
+        <w:numPr>
+          <w:ilvl w:val="2"/>
+          <w:numId w:val="1008"/>
+        </w:numPr>
+      </w:pPr>
+      <m:oMath>
+        <m:sSub>
+          <m:e>
+            <m:r>
+              <m:t>l</m:t>
+            </m:r>
+          </m:e>
+          <m:sub>
+            <m:r>
+              <m:t>t</m:t>
+            </m:r>
+            <m:r>
+              <m:rPr>
+                <m:sty m:val="p"/>
+              </m:rPr>
+              <m:t>−</m:t>
+            </m:r>
+            <m:r>
+              <m:t>1</m:t>
+            </m:r>
+          </m:sub>
+        </m:sSub>
+      </m:oMath>
+      <w:r>
+        <w:t xml:space="preserve">: log of mean workers</w:t>
+      </w:r>
+    </w:p>
+    <w:p>
+      <w:pPr>
+        <w:pStyle w:val="Compact"/>
+        <w:numPr>
+          <w:ilvl w:val="2"/>
+          <w:numId w:val="1008"/>
+        </w:numPr>
+      </w:pPr>
+      <m:oMath>
+        <m:sSub>
+          <m:e>
+            <m:r>
+              <m:t>m</m:t>
+            </m:r>
+          </m:e>
+          <m:sub>
+            <m:r>
+              <m:t>t</m:t>
+            </m:r>
+            <m:r>
+              <m:rPr>
+                <m:sty m:val="p"/>
+              </m:rPr>
+              <m:t>−</m:t>
+            </m:r>
+            <m:r>
+              <m:t>1</m:t>
+            </m:r>
+          </m:sub>
+        </m:sSub>
+      </m:oMath>
+      <w:r>
+        <w:t xml:space="preserve">: log of</w:t>
+      </w:r>
+      <w:r>
+        <w:t xml:space="preserve"> </w:t>
+      </w:r>
+      <w:r>
+        <w:t xml:space="preserve">“ordinary expenses”</w:t>
+      </w:r>
+    </w:p>
+    <w:p>
+      <w:pPr>
+        <w:pStyle w:val="Compact"/>
+        <w:numPr>
+          <w:ilvl w:val="2"/>
+          <w:numId w:val="1008"/>
+        </w:numPr>
+      </w:pPr>
+      <m:oMath>
+        <m:sSub>
+          <m:e>
+            <m:r>
+              <m:t>k</m:t>
+            </m:r>
+          </m:e>
+          <m:sub>
+            <m:r>
+              <m:t>t</m:t>
+            </m:r>
+            <m:r>
+              <m:rPr>
+                <m:sty m:val="p"/>
+              </m:rPr>
+              <m:t>−</m:t>
+            </m:r>
+            <m:r>
+              <m:t>1</m:t>
+            </m:r>
+          </m:sub>
+        </m:sSub>
+      </m:oMath>
+      <w:r>
+        <w:t xml:space="preserve">: perpetual inventory method on</w:t>
+      </w:r>
+      <w:r>
+        <w:t xml:space="preserve"> </w:t>
+      </w:r>
+      <w:r>
+        <w:t xml:space="preserve">“extraordinary expenses”</w:t>
+      </w:r>
+    </w:p>
+    <w:p>
+      <w:pPr>
+        <w:pStyle w:val="Compact"/>
+        <w:numPr>
+          <w:ilvl w:val="2"/>
+          <w:numId w:val="1008"/>
+        </w:numPr>
+      </w:pPr>
+      <m:oMath>
+        <m:sSub>
+          <m:e>
+            <m:r>
+              <m:t>w</m:t>
+            </m:r>
+          </m:e>
+          <m:sub>
+            <m:r>
+              <m:t>t</m:t>
+            </m:r>
+            <m:r>
+              <m:rPr>
+                <m:sty m:val="p"/>
+              </m:rPr>
+              <m:t>−</m:t>
+            </m:r>
+            <m:r>
+              <m:t>1</m:t>
+            </m:r>
+          </m:sub>
+        </m:sSub>
+      </m:oMath>
+      <w:r>
+        <w:t xml:space="preserve">: log of agricultural wage rate in the same region (labor supply shifter but does not affect productivity shocks)</w:t>
+      </w:r>
+    </w:p>
+    <w:p>
+      <w:pPr>
+        <w:pStyle w:val="Compact"/>
+        <w:numPr>
+          <w:ilvl w:val="0"/>
+          <w:numId w:val="1002"/>
+        </w:numPr>
+      </w:pPr>
+      <w:r>
+        <w:t xml:space="preserve">Labor supply elasticity</w:t>
+      </w:r>
+    </w:p>
+    <w:p>
+      <w:pPr>
+        <w:pStyle w:val="Compact"/>
+        <w:numPr>
+          <w:ilvl w:val="1"/>
+          <w:numId w:val="1009"/>
+        </w:numPr>
+      </w:pPr>
+      <w:r>
+        <w:t xml:space="preserve">IV=agricultural wages</w:t>
+      </w:r>
+    </w:p>
+    <w:bookmarkEnd w:id="28"/>
+    <w:bookmarkStart w:id="34" w:name="why-the-wage-markdown-matters"/>
+    <w:p>
+      <w:pPr>
+        <w:pStyle w:val="Heading2"/>
+      </w:pPr>
+      <w:r>
+        <w:t xml:space="preserve">Why the wage markdown matters</w:t>
+      </w:r>
+    </w:p>
+    <w:p>
+      <w:pPr>
+        <w:pStyle w:val="Compact"/>
+        <w:numPr>
+          <w:ilvl w:val="0"/>
+          <w:numId w:val="1010"/>
+        </w:numPr>
+      </w:pPr>
+      <w:r>
+        <w:t xml:space="preserve">Intrinsic interest: Is labour exploited?</w:t>
+      </w:r>
+    </w:p>
+    <w:p>
+      <w:pPr>
+        <w:pStyle w:val="Compact"/>
+        <w:numPr>
+          <w:ilvl w:val="0"/>
+          <w:numId w:val="1010"/>
+        </w:numPr>
+      </w:pPr>
+      <w:r>
+        <w:t xml:space="preserve">Analytical interest:</w:t>
+      </w:r>
+    </w:p>
+    <w:p>
+      <w:pPr>
+        <w:pStyle w:val="Compact"/>
+        <w:numPr>
+          <w:ilvl w:val="1"/>
+          <w:numId w:val="1011"/>
+        </w:numPr>
+      </w:pPr>
+      <w:r>
+        <w:t xml:space="preserve">How big is the welfare (deadweight) loss?</w:t>
+      </w:r>
+    </w:p>
+    <w:p>
+      <w:pPr>
+        <w:pStyle w:val="Compact"/>
+        <w:numPr>
+          <w:ilvl w:val="1"/>
+          <w:numId w:val="1011"/>
+        </w:numPr>
+      </w:pPr>
+      <w:r>
+        <w:t xml:space="preserve">Markdown↑, markups↑ ⇒ TFP↓, inflation↑</w:t>
+      </w:r>
+      <w:r>
+        <w:rPr>
+          <w:rStyle w:val="FootnoteReference"/>
+        </w:rPr>
+        <w:footnoteReference w:id="29"/>
+      </w:r>
+    </w:p>
+    <w:p>
+      <w:pPr>
+        <w:pStyle w:val="Compact"/>
+        <w:numPr>
+          <w:ilvl w:val="0"/>
+          <w:numId w:val="1010"/>
+        </w:numPr>
+      </w:pPr>
+      <w:r>
+        <w:t xml:space="preserve">Need to look at both ends: An exploited (from steel plants, railways) needs to be an exploiter (coal mine)</w:t>
+      </w:r>
+    </w:p>
+    <w:p>
+      <w:pPr>
+        <w:pStyle w:val="Compact"/>
+        <w:numPr>
+          <w:ilvl w:val="0"/>
+          <w:numId w:val="1010"/>
         </w:numPr>
       </w:pPr>
       <w:r>
@@ -550,7 +1452,7 @@
         <w:rPr>
           <w:rStyle w:val="FootnoteReference"/>
         </w:rPr>
-        <w:footnoteReference w:id="29"/>
+        <w:footnoteReference w:id="30"/>
       </w:r>
     </w:p>
     <w:p>
@@ -1086,7 +1988,7 @@
         <w:rPr>
           <w:rStyle w:val="FootnoteReference"/>
         </w:rPr>
-        <w:footnoteReference w:id="30"/>
+        <w:footnoteReference w:id="31"/>
       </w:r>
       <w:r>
         <w:t xml:space="preserve"> </w:t>
@@ -1095,7 +1997,7 @@
         <w:rPr>
           <w:rStyle w:val="FootnoteReference"/>
         </w:rPr>
-        <w:footnoteReference w:id="31"/>
+        <w:footnoteReference w:id="32"/>
       </w:r>
     </w:p>
     <w:p>
@@ -1668,7 +2570,7 @@
         <w:pStyle w:val="Compact"/>
         <w:numPr>
           <w:ilvl w:val="0"/>
-          <w:numId w:val="1004"/>
+          <w:numId w:val="1012"/>
         </w:numPr>
       </w:pPr>
       <w:r>
@@ -1680,7 +2582,7 @@
         <w:pStyle w:val="Compact"/>
         <w:numPr>
           <w:ilvl w:val="0"/>
-          <w:numId w:val="1004"/>
+          <w:numId w:val="1012"/>
         </w:numPr>
       </w:pPr>
       <w:r>
@@ -1690,7 +2592,7 @@
         <w:rPr>
           <w:rStyle w:val="FootnoteReference"/>
         </w:rPr>
-        <w:footnoteReference w:id="32"/>
+        <w:footnoteReference w:id="33"/>
       </w:r>
     </w:p>
     <w:p>
@@ -1698,7 +2600,7 @@
         <w:pStyle w:val="Compact"/>
         <w:numPr>
           <w:ilvl w:val="0"/>
-          <w:numId w:val="1004"/>
+          <w:numId w:val="1012"/>
         </w:numPr>
       </w:pPr>
       <w:r>
@@ -1722,8 +2624,8 @@
         <w:t xml:space="preserve">?</w:t>
       </w:r>
     </w:p>
-    <w:bookmarkEnd w:id="33"/>
-    <w:bookmarkStart w:id="48" w:name="model"/>
+    <w:bookmarkEnd w:id="34"/>
+    <w:bookmarkStart w:id="49" w:name="model"/>
     <w:p>
       <w:pPr>
         <w:pStyle w:val="Heading2"/>
@@ -1732,7 +2634,7 @@
         <w:t xml:space="preserve">Model</w:t>
       </w:r>
     </w:p>
-    <w:bookmarkStart w:id="39" w:name="primitives"/>
+    <w:bookmarkStart w:id="40" w:name="primitives"/>
     <w:p>
       <w:pPr>
         <w:pStyle w:val="Heading3"/>
@@ -1744,7 +2646,7 @@
     <w:tbl>
       <w:tblPr>
         <w:tblStyle w:val="Table"/>
-        <w:tblLook w:firstRow="0" w:lastRow="0" w:firstColumn="0" w:lastColumn="0" w:noHBand="0" w:noVBand="0" w:val="0000"/>
+        <w:tblInd w:w="164" w:type="dxa"/>
         <w:tblBorders>
           <w:left w:val="single" w:sz="24" w:space="0" w:color="CC1914"/>
         </w:tblBorders>
@@ -1752,8 +2654,11 @@
           <w:left w:w="0" w:type="dxa"/>
           <w:right w:w="0" w:type="dxa"/>
         </w:tblCellMar>
-        <w:tblInd w:w="164" w:type="dxa"/>
+        <w:tblLook w:firstRow="0" w:lastRow="0" w:firstColumn="0" w:lastColumn="0" w:noHBand="0" w:noVBand="0" w:val="0000"/>
       </w:tblPr>
+      <w:tblGrid>
+        <w:gridCol w:w="7920"/>
+      </w:tblGrid>
       <w:tr>
         <w:trPr>
           <w:cantSplit/>
@@ -2892,7 +3797,7 @@
         <w:rPr>
           <w:rStyle w:val="FootnoteReference"/>
         </w:rPr>
-        <w:footnoteReference w:id="34"/>
+        <w:footnoteReference w:id="35"/>
       </w:r>
     </w:p>
     <w:p>
@@ -3053,7 +3958,7 @@
         <w:rPr>
           <w:rStyle w:val="FootnoteReference"/>
         </w:rPr>
-        <w:footnoteReference w:id="35"/>
+        <w:footnoteReference w:id="36"/>
       </w:r>
     </w:p>
     <w:p>
@@ -3148,7 +4053,7 @@
         <w:rPr>
           <w:rStyle w:val="FootnoteReference"/>
         </w:rPr>
-        <w:footnoteReference w:id="36"/>
+        <w:footnoteReference w:id="37"/>
       </w:r>
     </w:p>
     <w:p>
@@ -4818,7 +5723,7 @@
         <w:rPr>
           <w:rStyle w:val="FootnoteReference"/>
         </w:rPr>
-        <w:footnoteReference w:id="37"/>
+        <w:footnoteReference w:id="38"/>
       </w:r>
     </w:p>
     <w:p>
@@ -4832,7 +5737,7 @@
         <w:rPr>
           <w:rStyle w:val="FootnoteReference"/>
         </w:rPr>
-        <w:footnoteReference w:id="38"/>
+        <w:footnoteReference w:id="39"/>
       </w:r>
     </w:p>
     <w:p>
@@ -4909,8 +5814,8 @@
         </m:oMath>
       </m:oMathPara>
     </w:p>
-    <w:bookmarkEnd w:id="39"/>
-    <w:bookmarkStart w:id="44" w:name="no-collusion-lambda_fgt0"/>
+    <w:bookmarkEnd w:id="40"/>
+    <w:bookmarkStart w:id="45" w:name="no-collusion-lambda_fgt0"/>
     <w:p>
       <w:pPr>
         <w:pStyle w:val="Heading3"/>
@@ -5049,18 +5954,18 @@
           <wp:inline>
             <wp:extent cx="5334000" cy="3035875"/>
             <wp:effectExtent b="0" l="0" r="0" t="0"/>
-            <wp:docPr descr="stata code" title="" id="41" name="Picture"/>
+            <wp:docPr descr="stata code" title="" id="42" name="Picture"/>
             <a:graphic>
               <a:graphicData uri="http://schemas.openxmlformats.org/drawingml/2006/picture">
                 <pic:pic>
                   <pic:nvPicPr>
-                    <pic:cNvPr descr="./dofile.jpg" id="42" name="Picture"/>
+                    <pic:cNvPr descr="./dofile.jpg" id="43" name="Picture"/>
                     <pic:cNvPicPr>
                       <a:picLocks noChangeArrowheads="1" noChangeAspect="1"/>
                     </pic:cNvPicPr>
                   </pic:nvPicPr>
                   <pic:blipFill>
-                    <a:blip r:embed="rId40"/>
+                    <a:blip r:embed="rId41"/>
                     <a:stretch>
                       <a:fillRect/>
                     </a:stretch>
@@ -5112,7 +6017,7 @@
         <w:rPr>
           <w:rStyle w:val="FootnoteReference"/>
         </w:rPr>
-        <w:footnoteReference w:id="43"/>
+        <w:footnoteReference w:id="44"/>
       </w:r>
     </w:p>
     <w:p>
@@ -5215,15 +6120,15 @@
         <w:pStyle w:val="Compact"/>
         <w:numPr>
           <w:ilvl w:val="0"/>
-          <w:numId w:val="1005"/>
+          <w:numId w:val="1013"/>
         </w:numPr>
       </w:pPr>
       <w:r>
         <w:t xml:space="preserve">Markdown is greater for larger firms</w:t>
       </w:r>
     </w:p>
-    <w:bookmarkEnd w:id="44"/>
-    <w:bookmarkStart w:id="45" w:name="perfect-collusion-lambda_fgt1"/>
+    <w:bookmarkEnd w:id="45"/>
+    <w:bookmarkStart w:id="46" w:name="perfect-collusion-lambda_fgt1"/>
     <w:p>
       <w:pPr>
         <w:pStyle w:val="Heading3"/>
@@ -5573,15 +6478,15 @@
         <w:pStyle w:val="Compact"/>
         <w:numPr>
           <w:ilvl w:val="0"/>
-          <w:numId w:val="1006"/>
+          <w:numId w:val="1014"/>
         </w:numPr>
       </w:pPr>
       <w:r>
         <w:t xml:space="preserve">Markdown is uniform across firms</w:t>
       </w:r>
     </w:p>
-    <w:bookmarkEnd w:id="45"/>
-    <w:bookmarkStart w:id="47" w:name="intermediate-case-lambda_fgtin-01"/>
+    <w:bookmarkEnd w:id="46"/>
+    <w:bookmarkStart w:id="48" w:name="intermediate-case-lambda_fgtin-01"/>
     <w:p>
       <w:pPr>
         <w:pStyle w:val="Heading3"/>
@@ -5951,7 +6856,7 @@
         <w:pStyle w:val="Compact"/>
         <w:numPr>
           <w:ilvl w:val="0"/>
-          <w:numId w:val="1007"/>
+          <w:numId w:val="1015"/>
         </w:numPr>
       </w:pPr>
       <w:r>
@@ -6024,7 +6929,7 @@
         <w:rPr>
           <w:rStyle w:val="FootnoteReference"/>
         </w:rPr>
-        <w:footnoteReference w:id="46"/>
+        <w:footnoteReference w:id="47"/>
       </w:r>
     </w:p>
     <w:p>
@@ -6204,7 +7109,7 @@
     <w:tbl>
       <w:tblPr>
         <w:tblStyle w:val="Table"/>
-        <w:tblLook w:firstRow="0" w:lastRow="0" w:firstColumn="0" w:lastColumn="0" w:noHBand="0" w:noVBand="0" w:val="0000"/>
+        <w:tblInd w:w="164" w:type="dxa"/>
         <w:tblBorders>
           <w:left w:val="single" w:sz="24" w:space="0" w:color="CC1914"/>
         </w:tblBorders>
@@ -6212,8 +7117,11 @@
           <w:left w:w="0" w:type="dxa"/>
           <w:right w:w="0" w:type="dxa"/>
         </w:tblCellMar>
-        <w:tblInd w:w="164" w:type="dxa"/>
+        <w:tblLook w:firstRow="0" w:lastRow="0" w:firstColumn="0" w:lastColumn="0" w:noHBand="0" w:noVBand="0" w:val="0000"/>
       </w:tblPr>
+      <w:tblGrid>
+        <w:gridCol w:w="7920"/>
+      </w:tblGrid>
       <w:tr>
         <w:trPr>
           <w:cantSplit/>
@@ -6593,9 +7501,9 @@
         </w:tc>
       </w:tr>
     </w:tbl>
-    <w:bookmarkEnd w:id="47"/>
     <w:bookmarkEnd w:id="48"/>
-    <w:bookmarkStart w:id="56" w:name="sec-identification"/>
+    <w:bookmarkEnd w:id="49"/>
+    <w:bookmarkStart w:id="57" w:name="sec-identification"/>
     <w:p>
       <w:pPr>
         <w:pStyle w:val="Heading2"/>
@@ -6622,7 +7530,7 @@
         <w:pStyle w:val="Compact"/>
         <w:numPr>
           <w:ilvl w:val="0"/>
-          <w:numId w:val="1008"/>
+          <w:numId w:val="1016"/>
         </w:numPr>
       </w:pPr>
       <w:r>
@@ -6687,7 +7595,7 @@
         <w:pStyle w:val="Compact"/>
         <w:numPr>
           <w:ilvl w:val="0"/>
-          <w:numId w:val="1008"/>
+          <w:numId w:val="1016"/>
         </w:numPr>
       </w:pPr>
       <w:r>
@@ -6737,7 +7645,7 @@
         <w:pStyle w:val="Compact"/>
         <w:numPr>
           <w:ilvl w:val="0"/>
-          <w:numId w:val="1008"/>
+          <w:numId w:val="1016"/>
         </w:numPr>
       </w:pPr>
       <m:oMath>
@@ -6835,7 +7743,7 @@
         <w:pStyle w:val="Compact"/>
         <w:numPr>
           <w:ilvl w:val="0"/>
-          <w:numId w:val="1008"/>
+          <w:numId w:val="1016"/>
         </w:numPr>
       </w:pPr>
       <w:r>
@@ -6868,7 +7776,7 @@
         <w:rPr>
           <w:rStyle w:val="FootnoteReference"/>
         </w:rPr>
-        <w:footnoteReference w:id="49"/>
+        <w:footnoteReference w:id="50"/>
       </w:r>
     </w:p>
     <w:p>
@@ -7014,7 +7922,7 @@
         <w:pStyle w:val="Compact"/>
         <w:numPr>
           <w:ilvl w:val="0"/>
-          <w:numId w:val="1009"/>
+          <w:numId w:val="1017"/>
         </w:numPr>
       </w:pPr>
       <w:r>
@@ -7024,7 +7932,7 @@
     <w:tbl>
       <w:tblPr>
         <w:tblStyle w:val="Table"/>
-        <w:tblLook w:firstRow="0" w:lastRow="0" w:firstColumn="0" w:lastColumn="0" w:noHBand="0" w:noVBand="0" w:val="0000"/>
+        <w:tblInd w:w="164" w:type="dxa"/>
         <w:tblBorders>
           <w:left w:val="single" w:sz="24" w:space="0" w:color="CC1914"/>
         </w:tblBorders>
@@ -7032,8 +7940,11 @@
           <w:left w:w="0" w:type="dxa"/>
           <w:right w:w="0" w:type="dxa"/>
         </w:tblCellMar>
-        <w:tblInd w:w="164" w:type="dxa"/>
+        <w:tblLook w:firstRow="0" w:lastRow="0" w:firstColumn="0" w:lastColumn="0" w:noHBand="0" w:noVBand="0" w:val="0000"/>
       </w:tblPr>
+      <w:tblGrid>
+        <w:gridCol w:w="7920"/>
+      </w:tblGrid>
       <w:tr>
         <w:trPr>
           <w:cantSplit/>
@@ -7064,7 +7975,7 @@
               <w:pStyle w:val="Compact"/>
               <w:numPr>
                 <w:ilvl w:val="0"/>
-                <w:numId w:val="1010"/>
+                <w:numId w:val="1018"/>
               </w:numPr>
             </w:pPr>
             <w:r>
@@ -7091,7 +8002,7 @@
               <w:rPr>
                 <w:rStyle w:val="FootnoteReference"/>
               </w:rPr>
-              <w:footnoteReference w:id="50"/>
+              <w:footnoteReference w:id="51"/>
             </w:r>
             <w:r>
               <w:t xml:space="preserve"> </w:t>
@@ -7100,10 +8011,7 @@
               <w:rPr>
                 <w:rStyle w:val="FootnoteReference"/>
               </w:rPr>
-              <w:footnoteReference w:id="51"/>
-            </w:r>
-            <w:r>
-              <w:t xml:space="preserve"> </w:t>
+              <w:footnoteReference w:id="52"/>
             </w:r>
           </w:p>
           <w:p>
@@ -7111,7 +8019,7 @@
               <w:pStyle w:val="Compact"/>
               <w:numPr>
                 <w:ilvl w:val="0"/>
-                <w:numId w:val="1010"/>
+                <w:numId w:val="1019"/>
               </w:numPr>
             </w:pPr>
             <w:r>
@@ -7143,7 +8051,7 @@
         <w:pStyle w:val="Compact"/>
         <w:numPr>
           <w:ilvl w:val="0"/>
-          <w:numId w:val="1011"/>
+          <w:numId w:val="1020"/>
         </w:numPr>
       </w:pPr>
       <w:r>
@@ -7226,40 +8134,11 @@
         <w:pStyle w:val="Compact"/>
         <w:numPr>
           <w:ilvl w:val="0"/>
-          <w:numId w:val="1011"/>
+          <w:numId w:val="1020"/>
         </w:numPr>
       </w:pPr>
       <w:r>
         <w:t xml:space="preserve">Not an equilibrium condition, so comparative statics is not tenable</w:t>
-      </w:r>
-      <w:r>
-        <w:rPr>
-          <w:rStyle w:val="FootnoteReference"/>
-        </w:rPr>
-        <w:footnoteReference w:id="52"/>
-      </w:r>
-      <w:r>
-        <w:t xml:space="preserve"> </w:t>
-      </w:r>
-    </w:p>
-    <w:p>
-      <w:pPr>
-        <w:pStyle w:val="FirstParagraph"/>
-      </w:pPr>
-      <w:r>
-        <w:t xml:space="preserve">To get LHS of</w:t>
-      </w:r>
-      <w:r>
-        <w:t xml:space="preserve"> </w:t>
-      </w:r>
-      <w:r>
-        <w:t xml:space="preserve">, rearrange FOC in</w:t>
-      </w:r>
-      <w:r>
-        <w:t xml:space="preserve"> </w:t>
-      </w:r>
-      <w:r>
-        <w:t xml:space="preserve">.</w:t>
       </w:r>
       <w:r>
         <w:rPr>
@@ -7270,24 +8149,34 @@
       <w:r>
         <w:t xml:space="preserve"> </w:t>
       </w:r>
+    </w:p>
+    <w:p>
+      <w:pPr>
+        <w:pStyle w:val="FirstParagraph"/>
+      </w:pPr>
+      <w:r>
+        <w:t xml:space="preserve">To get LHS of</w:t>
+      </w:r>
+      <w:r>
+        <w:t xml:space="preserve"> </w:t>
+      </w:r>
+      <w:r>
+        <w:t xml:space="preserve">, rearrange FOC in</w:t>
+      </w:r>
+      <w:r>
+        <w:t xml:space="preserve"> </w:t>
+      </w:r>
+      <w:r>
+        <w:t xml:space="preserve">.</w:t>
+      </w:r>
       <w:r>
         <w:rPr>
           <w:rStyle w:val="FootnoteReference"/>
         </w:rPr>
         <w:footnoteReference w:id="54"/>
       </w:r>
-    </w:p>
-    <w:p>
-      <w:pPr>
-        <w:pStyle w:val="FirstParagraph"/>
-      </w:pPr>
-    </w:p>
-    <w:p>
-      <w:pPr>
-        <w:pStyle w:val="BodyText"/>
-      </w:pPr>
-      <w:r>
-        <w:t xml:space="preserve">Markup</w:t>
+      <w:r>
+        <w:t xml:space="preserve"> </w:t>
       </w:r>
       <w:r>
         <w:rPr>
@@ -7295,12 +8184,31 @@
         </w:rPr>
         <w:footnoteReference w:id="55"/>
       </w:r>
-      <w:r>
-        <w:t xml:space="preserve"> </w:t>
-      </w:r>
-    </w:p>
-    <w:bookmarkEnd w:id="56"/>
-    <w:bookmarkStart w:id="57" w:name="estimation"/>
+    </w:p>
+    <w:p>
+      <w:pPr>
+        <w:pStyle w:val="FirstParagraph"/>
+      </w:pPr>
+    </w:p>
+    <w:p>
+      <w:pPr>
+        <w:pStyle w:val="BodyText"/>
+      </w:pPr>
+      <w:r>
+        <w:t xml:space="preserve">Markup</w:t>
+      </w:r>
+      <w:r>
+        <w:rPr>
+          <w:rStyle w:val="FootnoteReference"/>
+        </w:rPr>
+        <w:footnoteReference w:id="56"/>
+      </w:r>
+      <w:r>
+        <w:t xml:space="preserve"> </w:t>
+      </w:r>
+    </w:p>
+    <w:bookmarkEnd w:id="57"/>
+    <w:bookmarkStart w:id="58" w:name="estimation"/>
     <w:p>
       <w:pPr>
         <w:pStyle w:val="Heading2"/>
@@ -7572,8 +8480,8 @@
         <w:t xml:space="preserve"> </w:t>
       </w:r>
     </w:p>
-    <w:bookmarkEnd w:id="57"/>
-    <w:bookmarkStart w:id="58" w:name="data"/>
+    <w:bookmarkEnd w:id="58"/>
+    <w:bookmarkStart w:id="59" w:name="data"/>
     <w:p>
       <w:pPr>
         <w:pStyle w:val="Heading2"/>
@@ -7587,7 +8495,7 @@
         <w:pStyle w:val="Compact"/>
         <w:numPr>
           <w:ilvl w:val="0"/>
-          <w:numId w:val="1012"/>
+          <w:numId w:val="1021"/>
         </w:numPr>
       </w:pPr>
       <w:r>
@@ -7599,7 +8507,7 @@
         <w:pStyle w:val="Compact"/>
         <w:numPr>
           <w:ilvl w:val="0"/>
-          <w:numId w:val="1012"/>
+          <w:numId w:val="1021"/>
         </w:numPr>
       </w:pPr>
       <w:r>
@@ -7611,7 +8519,7 @@
         <w:pStyle w:val="Compact"/>
         <w:numPr>
           <w:ilvl w:val="1"/>
-          <w:numId w:val="1013"/>
+          <w:numId w:val="1022"/>
         </w:numPr>
       </w:pPr>
       <w:r>
@@ -7623,7 +8531,7 @@
         <w:pStyle w:val="Compact"/>
         <w:numPr>
           <w:ilvl w:val="1"/>
-          <w:numId w:val="1013"/>
+          <w:numId w:val="1022"/>
         </w:numPr>
       </w:pPr>
       <w:r>
@@ -7635,7 +8543,7 @@
         <w:pStyle w:val="Compact"/>
         <w:numPr>
           <w:ilvl w:val="0"/>
-          <w:numId w:val="1012"/>
+          <w:numId w:val="1021"/>
         </w:numPr>
       </w:pPr>
       <w:r>
@@ -7647,21 +8555,21 @@
         <w:pStyle w:val="Compact"/>
         <w:numPr>
           <w:ilvl w:val="0"/>
-          <w:numId w:val="1012"/>
+          <w:numId w:val="1021"/>
         </w:numPr>
       </w:pPr>
       <w:r>
         <w:t xml:space="preserve">Other: Opening dates of railroad and tramway stations, agricultural wages</w:t>
       </w:r>
     </w:p>
-    <w:bookmarkEnd w:id="58"/>
-    <w:bookmarkStart w:id="61" w:name="research-design"/>
+    <w:bookmarkEnd w:id="59"/>
+    <w:bookmarkStart w:id="62" w:name="research-design2"/>
     <w:p>
       <w:pPr>
         <w:pStyle w:val="Heading2"/>
       </w:pPr>
       <w:r>
-        <w:t xml:space="preserve">Research design</w:t>
+        <w:t xml:space="preserve">Research design2</w:t>
       </w:r>
     </w:p>
     <w:p>
@@ -7669,7 +8577,7 @@
         <w:pStyle w:val="Compact"/>
         <w:numPr>
           <w:ilvl w:val="0"/>
-          <w:numId w:val="1014"/>
+          <w:numId w:val="1023"/>
         </w:numPr>
       </w:pPr>
       <m:oMath>
@@ -7709,7 +8617,7 @@
         <w:pStyle w:val="Compact"/>
         <w:numPr>
           <w:ilvl w:val="0"/>
-          <w:numId w:val="1014"/>
+          <w:numId w:val="1023"/>
         </w:numPr>
       </w:pPr>
       <w:r>
@@ -7721,7 +8629,7 @@
         <w:pStyle w:val="Compact"/>
         <w:numPr>
           <w:ilvl w:val="0"/>
-          <w:numId w:val="1014"/>
+          <w:numId w:val="1023"/>
         </w:numPr>
       </w:pPr>
       <w:r>
@@ -7794,7 +8702,7 @@
         <w:pStyle w:val="Compact"/>
         <w:numPr>
           <w:ilvl w:val="0"/>
-          <w:numId w:val="1014"/>
+          <w:numId w:val="1023"/>
         </w:numPr>
       </w:pPr>
       <w:r>
@@ -7919,7 +8827,7 @@
         <w:pStyle w:val="Compact"/>
         <w:numPr>
           <w:ilvl w:val="0"/>
-          <w:numId w:val="1014"/>
+          <w:numId w:val="1023"/>
         </w:numPr>
       </w:pPr>
       <w:r>
@@ -7931,20 +8839,11 @@
         <w:pStyle w:val="Compact"/>
         <w:numPr>
           <w:ilvl w:val="0"/>
-          <w:numId w:val="1014"/>
+          <w:numId w:val="1023"/>
         </w:numPr>
       </w:pPr>
       <w:r>
         <w:t xml:space="preserve">Hypothesis: Degree of collusion vs. collusion regimes: collusion↑ (cartel) ⇒ markdown↑</w:t>
-      </w:r>
-      <w:r>
-        <w:rPr>
-          <w:rStyle w:val="FootnoteReference"/>
-        </w:rPr>
-        <w:footnoteReference w:id="59"/>
-      </w:r>
-      <w:r>
-        <w:t xml:space="preserve"> </w:t>
       </w:r>
       <w:r>
         <w:rPr>
@@ -7952,9 +8851,18 @@
         </w:rPr>
         <w:footnoteReference w:id="60"/>
       </w:r>
-    </w:p>
-    <w:bookmarkEnd w:id="61"/>
-    <w:bookmarkStart w:id="76" w:name="results"/>
+      <w:r>
+        <w:t xml:space="preserve"> </w:t>
+      </w:r>
+      <w:r>
+        <w:rPr>
+          <w:rStyle w:val="FootnoteReference"/>
+        </w:rPr>
+        <w:footnoteReference w:id="61"/>
+      </w:r>
+    </w:p>
+    <w:bookmarkEnd w:id="62"/>
+    <w:bookmarkStart w:id="77" w:name="results"/>
     <w:p>
       <w:pPr>
         <w:pStyle w:val="Heading2"/>
@@ -7972,18 +8880,18 @@
           <wp:inline>
             <wp:extent cx="5334000" cy="4641486"/>
             <wp:effectExtent b="0" l="0" r="0" t="0"/>
-            <wp:docPr descr="Table 3" title="" id="63" name="Picture"/>
+            <wp:docPr descr="Table 3" title="" id="64" name="Picture"/>
             <a:graphic>
               <a:graphicData uri="http://schemas.openxmlformats.org/drawingml/2006/picture">
                 <pic:pic>
                   <pic:nvPicPr>
-                    <pic:cNvPr descr="./Tab3.jpg" id="64" name="Picture"/>
+                    <pic:cNvPr descr="./Tab3.jpg" id="65" name="Picture"/>
                     <pic:cNvPicPr>
                       <a:picLocks noChangeArrowheads="1" noChangeAspect="1"/>
                     </pic:cNvPicPr>
                   </pic:nvPicPr>
                   <pic:blipFill>
-                    <a:blip r:embed="rId62"/>
+                    <a:blip r:embed="rId63"/>
                     <a:stretch>
                       <a:fillRect/>
                     </a:stretch>
@@ -8027,18 +8935,18 @@
           <wp:inline>
             <wp:extent cx="5334000" cy="4150600"/>
             <wp:effectExtent b="0" l="0" r="0" t="0"/>
-            <wp:docPr descr="Figure 4A" title="" id="66" name="Picture"/>
+            <wp:docPr descr="Figure 4A" title="" id="67" name="Picture"/>
             <a:graphic>
               <a:graphicData uri="http://schemas.openxmlformats.org/drawingml/2006/picture">
                 <pic:pic>
                   <pic:nvPicPr>
-                    <pic:cNvPr descr="./Fig4A.jpg" id="67" name="Picture"/>
+                    <pic:cNvPr descr="./Fig4A.jpg" id="68" name="Picture"/>
                     <pic:cNvPicPr>
                       <a:picLocks noChangeArrowheads="1" noChangeAspect="1"/>
                     </pic:cNvPicPr>
                   </pic:nvPicPr>
                   <pic:blipFill>
-                    <a:blip r:embed="rId65"/>
+                    <a:blip r:embed="rId66"/>
                     <a:stretch>
                       <a:fillRect/>
                     </a:stretch>
@@ -8082,18 +8990,18 @@
           <wp:inline>
             <wp:extent cx="5334000" cy="4153560"/>
             <wp:effectExtent b="0" l="0" r="0" t="0"/>
-            <wp:docPr descr="Figure 4B" title="" id="69" name="Picture"/>
+            <wp:docPr descr="Figure 4B" title="" id="70" name="Picture"/>
             <a:graphic>
               <a:graphicData uri="http://schemas.openxmlformats.org/drawingml/2006/picture">
                 <pic:pic>
                   <pic:nvPicPr>
-                    <pic:cNvPr descr="./Fig4B.jpg" id="70" name="Picture"/>
+                    <pic:cNvPr descr="./Fig4B.jpg" id="71" name="Picture"/>
                     <pic:cNvPicPr>
                       <a:picLocks noChangeArrowheads="1" noChangeAspect="1"/>
                     </pic:cNvPicPr>
                   </pic:nvPicPr>
                   <pic:blipFill>
-                    <a:blip r:embed="rId68"/>
+                    <a:blip r:embed="rId69"/>
                     <a:stretch>
                       <a:fillRect/>
                     </a:stretch>
@@ -8131,7 +9039,7 @@
     <w:tbl>
       <w:tblPr>
         <w:tblStyle w:val="Table"/>
-        <w:tblLook w:firstRow="0" w:lastRow="0" w:firstColumn="0" w:lastColumn="0" w:noHBand="0" w:noVBand="0" w:val="0000"/>
+        <w:tblInd w:w="164" w:type="dxa"/>
         <w:tblBorders>
           <w:left w:val="single" w:sz="24" w:space="0" w:color="CC1914"/>
         </w:tblBorders>
@@ -8139,8 +9047,11 @@
           <w:left w:w="0" w:type="dxa"/>
           <w:right w:w="0" w:type="dxa"/>
         </w:tblCellMar>
-        <w:tblInd w:w="164" w:type="dxa"/>
+        <w:tblLook w:firstRow="0" w:lastRow="0" w:firstColumn="0" w:lastColumn="0" w:noHBand="0" w:noVBand="0" w:val="0000"/>
       </w:tblPr>
+      <w:tblGrid>
+        <w:gridCol w:w="7920"/>
+      </w:tblGrid>
       <w:tr>
         <w:trPr>
           <w:cantSplit/>
@@ -8182,7 +9093,7 @@
               <w:pStyle w:val="Compact"/>
               <w:numPr>
                 <w:ilvl w:val="0"/>
-                <w:numId w:val="1015"/>
+                <w:numId w:val="1024"/>
               </w:numPr>
             </w:pPr>
             <w:r>
@@ -8192,7 +9103,7 @@
               <w:rPr>
                 <w:rStyle w:val="FootnoteReference"/>
               </w:rPr>
-              <w:footnoteReference w:id="71"/>
+              <w:footnoteReference w:id="72"/>
             </w:r>
           </w:p>
         </w:tc>
@@ -8209,7 +9120,7 @@
     <w:tbl>
       <w:tblPr>
         <w:tblStyle w:val="Table"/>
-        <w:tblLook w:firstRow="0" w:lastRow="0" w:firstColumn="0" w:lastColumn="0" w:noHBand="0" w:noVBand="0" w:val="0000"/>
+        <w:tblInd w:w="164" w:type="dxa"/>
         <w:tblBorders>
           <w:left w:val="single" w:sz="24" w:space="0" w:color="CC1914"/>
         </w:tblBorders>
@@ -8217,8 +9128,11 @@
           <w:left w:w="0" w:type="dxa"/>
           <w:right w:w="0" w:type="dxa"/>
         </w:tblCellMar>
-        <w:tblInd w:w="164" w:type="dxa"/>
+        <w:tblLook w:firstRow="0" w:lastRow="0" w:firstColumn="0" w:lastColumn="0" w:noHBand="0" w:noVBand="0" w:val="0000"/>
       </w:tblPr>
+      <w:tblGrid>
+        <w:gridCol w:w="7920"/>
+      </w:tblGrid>
       <w:tr>
         <w:trPr>
           <w:cantSplit/>
@@ -8278,7 +9192,7 @@
               <w:pStyle w:val="Compact"/>
               <w:numPr>
                 <w:ilvl w:val="0"/>
-                <w:numId w:val="1016"/>
+                <w:numId w:val="1025"/>
               </w:numPr>
             </w:pPr>
             <w:r>
@@ -8307,7 +9221,7 @@
               <w:pStyle w:val="Compact"/>
               <w:numPr>
                 <w:ilvl w:val="0"/>
-                <w:numId w:val="1016"/>
+                <w:numId w:val="1025"/>
               </w:numPr>
             </w:pPr>
             <w:r>
@@ -8328,7 +9242,7 @@
     <w:tbl>
       <w:tblPr>
         <w:tblStyle w:val="Table"/>
-        <w:tblLook w:firstRow="0" w:lastRow="0" w:firstColumn="0" w:lastColumn="0" w:noHBand="0" w:noVBand="0" w:val="0000"/>
+        <w:tblInd w:w="164" w:type="dxa"/>
         <w:tblBorders>
           <w:left w:val="single" w:sz="24" w:space="0" w:color="CC1914"/>
         </w:tblBorders>
@@ -8336,8 +9250,11 @@
           <w:left w:w="0" w:type="dxa"/>
           <w:right w:w="0" w:type="dxa"/>
         </w:tblCellMar>
-        <w:tblInd w:w="164" w:type="dxa"/>
+        <w:tblLook w:firstRow="0" w:lastRow="0" w:firstColumn="0" w:lastColumn="0" w:noHBand="0" w:noVBand="0" w:val="0000"/>
       </w:tblPr>
+      <w:tblGrid>
+        <w:gridCol w:w="7920"/>
+      </w:tblGrid>
       <w:tr>
         <w:trPr>
           <w:cantSplit/>
@@ -8397,7 +9314,7 @@
               <w:pStyle w:val="Compact"/>
               <w:numPr>
                 <w:ilvl w:val="0"/>
-                <w:numId w:val="1017"/>
+                <w:numId w:val="1026"/>
               </w:numPr>
             </w:pPr>
             <m:oMath>
@@ -8420,7 +9337,7 @@
               <w:pStyle w:val="Compact"/>
               <w:numPr>
                 <w:ilvl w:val="0"/>
-                <w:numId w:val="1017"/>
+                <w:numId w:val="1026"/>
               </w:numPr>
             </w:pPr>
             <w:r>
@@ -8441,7 +9358,7 @@
     <w:tbl>
       <w:tblPr>
         <w:tblStyle w:val="Table"/>
-        <w:tblLook w:firstRow="0" w:lastRow="0" w:firstColumn="0" w:lastColumn="0" w:noHBand="0" w:noVBand="0" w:val="0000"/>
+        <w:tblInd w:w="164" w:type="dxa"/>
         <w:tblBorders>
           <w:left w:val="single" w:sz="24" w:space="0" w:color="CC1914"/>
         </w:tblBorders>
@@ -8449,8 +9366,11 @@
           <w:left w:w="0" w:type="dxa"/>
           <w:right w:w="0" w:type="dxa"/>
         </w:tblCellMar>
-        <w:tblInd w:w="164" w:type="dxa"/>
+        <w:tblLook w:firstRow="0" w:lastRow="0" w:firstColumn="0" w:lastColumn="0" w:noHBand="0" w:noVBand="0" w:val="0000"/>
       </w:tblPr>
+      <w:tblGrid>
+        <w:gridCol w:w="7920"/>
+      </w:tblGrid>
       <w:tr>
         <w:trPr>
           <w:cantSplit/>
@@ -8488,7 +9408,7 @@
               <w:pStyle w:val="Compact"/>
               <w:numPr>
                 <w:ilvl w:val="0"/>
-                <w:numId w:val="1018"/>
+                <w:numId w:val="1027"/>
               </w:numPr>
             </w:pPr>
             <w:r>
@@ -8561,7 +9481,7 @@
               <w:pStyle w:val="Compact"/>
               <w:numPr>
                 <w:ilvl w:val="0"/>
-                <w:numId w:val="1018"/>
+                <w:numId w:val="1027"/>
               </w:numPr>
             </w:pPr>
             <w:r>
@@ -8611,7 +9531,7 @@
               <w:pStyle w:val="Compact"/>
               <w:numPr>
                 <w:ilvl w:val="0"/>
-                <w:numId w:val="1018"/>
+                <w:numId w:val="1027"/>
               </w:numPr>
             </w:pPr>
             <w:r>
@@ -8647,36 +9567,6 @@
             </m:oMath>
             <w:r>
               <w:t xml:space="preserve">↑</w:t>
-            </w:r>
-            <w:r>
-              <w:rPr>
-                <w:rStyle w:val="FootnoteReference"/>
-              </w:rPr>
-              <w:footnoteReference w:id="72"/>
-            </w:r>
-          </w:p>
-          <w:p>
-            <w:pPr>
-              <w:pStyle w:val="Compact"/>
-              <w:numPr>
-                <w:ilvl w:val="0"/>
-                <w:numId w:val="1018"/>
-              </w:numPr>
-            </w:pPr>
-            <w:r>
-              <w:t xml:space="preserve">But can we say collusion is weaker under Employer Associations? Coal price levels increased by less in pre-cartel era.</w:t>
-            </w:r>
-          </w:p>
-          <w:p>
-            <w:pPr>
-              <w:pStyle w:val="Compact"/>
-              <w:numPr>
-                <w:ilvl w:val="0"/>
-                <w:numId w:val="1018"/>
-              </w:numPr>
-            </w:pPr>
-            <w:r>
-              <w:t xml:space="preserve">Strange features:</w:t>
             </w:r>
             <w:r>
               <w:rPr>
@@ -8689,8 +9579,38 @@
             <w:pPr>
               <w:pStyle w:val="Compact"/>
               <w:numPr>
+                <w:ilvl w:val="0"/>
+                <w:numId w:val="1027"/>
+              </w:numPr>
+            </w:pPr>
+            <w:r>
+              <w:t xml:space="preserve">But can we say collusion is weaker under Employer Associations? Coal price levels increased by less in pre-cartel era.</w:t>
+            </w:r>
+          </w:p>
+          <w:p>
+            <w:pPr>
+              <w:pStyle w:val="Compact"/>
+              <w:numPr>
+                <w:ilvl w:val="0"/>
+                <w:numId w:val="1027"/>
+              </w:numPr>
+            </w:pPr>
+            <w:r>
+              <w:t xml:space="preserve">Strange features:</w:t>
+            </w:r>
+            <w:r>
+              <w:rPr>
+                <w:rStyle w:val="FootnoteReference"/>
+              </w:rPr>
+              <w:footnoteReference w:id="74"/>
+            </w:r>
+          </w:p>
+          <w:p>
+            <w:pPr>
+              <w:pStyle w:val="Compact"/>
+              <w:numPr>
                 <w:ilvl w:val="1"/>
-                <w:numId w:val="1019"/>
+                <w:numId w:val="1028"/>
               </w:numPr>
             </w:pPr>
             <m:oMath>
@@ -8737,7 +9657,7 @@
               <w:pStyle w:val="Compact"/>
               <w:numPr>
                 <w:ilvl w:val="1"/>
-                <w:numId w:val="1019"/>
+                <w:numId w:val="1028"/>
               </w:numPr>
             </w:pPr>
             <m:oMath>
@@ -8822,7 +9742,7 @@
               <w:pStyle w:val="Compact"/>
               <w:numPr>
                 <w:ilvl w:val="1"/>
-                <w:numId w:val="1019"/>
+                <w:numId w:val="1028"/>
               </w:numPr>
             </w:pPr>
             <m:oMath>
@@ -8975,7 +9895,7 @@
               <w:pStyle w:val="Compact"/>
               <w:numPr>
                 <w:ilvl w:val="0"/>
-                <w:numId w:val="1018"/>
+                <w:numId w:val="1027"/>
               </w:numPr>
             </w:pPr>
             <w:r>
@@ -9043,7 +9963,7 @@
     <w:tbl>
       <w:tblPr>
         <w:tblStyle w:val="Table"/>
-        <w:tblLook w:firstRow="0" w:lastRow="0" w:firstColumn="0" w:lastColumn="0" w:noHBand="0" w:noVBand="0" w:val="0000"/>
+        <w:tblInd w:w="164" w:type="dxa"/>
         <w:tblBorders>
           <w:left w:val="single" w:sz="24" w:space="0" w:color="CC1914"/>
         </w:tblBorders>
@@ -9051,8 +9971,11 @@
           <w:left w:w="0" w:type="dxa"/>
           <w:right w:w="0" w:type="dxa"/>
         </w:tblCellMar>
-        <w:tblInd w:w="164" w:type="dxa"/>
+        <w:tblLook w:firstRow="0" w:lastRow="0" w:firstColumn="0" w:lastColumn="0" w:noHBand="0" w:noVBand="0" w:val="0000"/>
       </w:tblPr>
+      <w:tblGrid>
+        <w:gridCol w:w="7920"/>
+      </w:tblGrid>
       <w:tr>
         <w:trPr>
           <w:cantSplit/>
@@ -9120,7 +10043,7 @@
             <w:pPr>
               <w:numPr>
                 <w:ilvl w:val="0"/>
-                <w:numId w:val="1020"/>
+                <w:numId w:val="1029"/>
               </w:numPr>
             </w:pPr>
             <w:r>
@@ -9213,7 +10136,7 @@
     <w:tbl>
       <w:tblPr>
         <w:tblStyle w:val="Table"/>
-        <w:tblLook w:firstRow="0" w:lastRow="0" w:firstColumn="0" w:lastColumn="0" w:noHBand="0" w:noVBand="0" w:val="0000"/>
+        <w:tblInd w:w="164" w:type="dxa"/>
         <w:tblBorders>
           <w:left w:val="single" w:sz="24" w:space="0" w:color="CC1914"/>
         </w:tblBorders>
@@ -9221,8 +10144,11 @@
           <w:left w:w="0" w:type="dxa"/>
           <w:right w:w="0" w:type="dxa"/>
         </w:tblCellMar>
-        <w:tblInd w:w="164" w:type="dxa"/>
+        <w:tblLook w:firstRow="0" w:lastRow="0" w:firstColumn="0" w:lastColumn="0" w:noHBand="0" w:noVBand="0" w:val="0000"/>
       </w:tblPr>
+      <w:tblGrid>
+        <w:gridCol w:w="7920"/>
+      </w:tblGrid>
       <w:tr>
         <w:trPr>
           <w:cantSplit/>
@@ -9253,7 +10179,7 @@
               <w:pStyle w:val="Compact"/>
               <w:numPr>
                 <w:ilvl w:val="0"/>
-                <w:numId w:val="1021"/>
+                <w:numId w:val="1030"/>
               </w:numPr>
             </w:pPr>
             <w:r>
@@ -9265,7 +10191,7 @@
               <w:pStyle w:val="Compact"/>
               <w:numPr>
                 <w:ilvl w:val="0"/>
-                <w:numId w:val="1021"/>
+                <w:numId w:val="1030"/>
               </w:numPr>
             </w:pPr>
             <w:r>
@@ -9275,7 +10201,7 @@
               <w:rPr>
                 <w:rStyle w:val="FootnoteReference"/>
               </w:rPr>
-              <w:footnoteReference w:id="74"/>
+              <w:footnoteReference w:id="75"/>
             </w:r>
             <w:r>
               <w:t xml:space="preserve"> </w:t>
@@ -9323,7 +10249,7 @@
               <w:pStyle w:val="Compact"/>
               <w:numPr>
                 <w:ilvl w:val="0"/>
-                <w:numId w:val="1021"/>
+                <w:numId w:val="1030"/>
               </w:numPr>
             </w:pPr>
             <w:r>
@@ -9335,7 +10261,7 @@
               <w:pStyle w:val="Compact"/>
               <w:numPr>
                 <w:ilvl w:val="0"/>
-                <w:numId w:val="1021"/>
+                <w:numId w:val="1030"/>
               </w:numPr>
             </w:pPr>
             <w:r>
@@ -9356,7 +10282,7 @@
     <w:tbl>
       <w:tblPr>
         <w:tblStyle w:val="Table"/>
-        <w:tblLook w:firstRow="0" w:lastRow="0" w:firstColumn="0" w:lastColumn="0" w:noHBand="0" w:noVBand="0" w:val="0000"/>
+        <w:tblInd w:w="164" w:type="dxa"/>
         <w:tblBorders>
           <w:left w:val="single" w:sz="24" w:space="0" w:color="CC1914"/>
         </w:tblBorders>
@@ -9364,8 +10290,11 @@
           <w:left w:w="0" w:type="dxa"/>
           <w:right w:w="0" w:type="dxa"/>
         </w:tblCellMar>
-        <w:tblInd w:w="164" w:type="dxa"/>
+        <w:tblLook w:firstRow="0" w:lastRow="0" w:firstColumn="0" w:lastColumn="0" w:noHBand="0" w:noVBand="0" w:val="0000"/>
       </w:tblPr>
+      <w:tblGrid>
+        <w:gridCol w:w="7920"/>
+      </w:tblGrid>
       <w:tr>
         <w:trPr>
           <w:cantSplit/>
@@ -9396,7 +10325,7 @@
               <w:pStyle w:val="Compact"/>
               <w:numPr>
                 <w:ilvl w:val="0"/>
-                <w:numId w:val="1022"/>
+                <w:numId w:val="1031"/>
               </w:numPr>
             </w:pPr>
             <w:r>
@@ -9408,7 +10337,7 @@
               <w:pStyle w:val="Compact"/>
               <w:numPr>
                 <w:ilvl w:val="0"/>
-                <w:numId w:val="1022"/>
+                <w:numId w:val="1031"/>
               </w:numPr>
             </w:pPr>
             <w:r>
@@ -9420,7 +10349,7 @@
               <w:pStyle w:val="Compact"/>
               <w:numPr>
                 <w:ilvl w:val="0"/>
-                <w:numId w:val="1022"/>
+                <w:numId w:val="1031"/>
               </w:numPr>
             </w:pPr>
             <m:oMath>
@@ -9561,7 +10490,7 @@
               <w:rPr>
                 <w:rStyle w:val="FootnoteReference"/>
               </w:rPr>
-              <w:footnoteReference w:id="75"/>
+              <w:footnoteReference w:id="76"/>
             </w:r>
           </w:p>
         </w:tc>
@@ -9578,7 +10507,7 @@
     <w:tbl>
       <w:tblPr>
         <w:tblStyle w:val="Table"/>
-        <w:tblLook w:firstRow="0" w:lastRow="0" w:firstColumn="0" w:lastColumn="0" w:noHBand="0" w:noVBand="0" w:val="0000"/>
+        <w:tblInd w:w="164" w:type="dxa"/>
         <w:tblBorders>
           <w:left w:val="single" w:sz="24" w:space="0" w:color="CC1914"/>
         </w:tblBorders>
@@ -9586,8 +10515,11 @@
           <w:left w:w="0" w:type="dxa"/>
           <w:right w:w="0" w:type="dxa"/>
         </w:tblCellMar>
-        <w:tblInd w:w="164" w:type="dxa"/>
+        <w:tblLook w:firstRow="0" w:lastRow="0" w:firstColumn="0" w:lastColumn="0" w:noHBand="0" w:noVBand="0" w:val="0000"/>
       </w:tblPr>
+      <w:tblGrid>
+        <w:gridCol w:w="7920"/>
+      </w:tblGrid>
       <w:tr>
         <w:trPr>
           <w:cantSplit/>
@@ -9629,7 +10561,7 @@
               <w:pStyle w:val="Compact"/>
               <w:numPr>
                 <w:ilvl w:val="0"/>
-                <w:numId w:val="1023"/>
+                <w:numId w:val="1032"/>
               </w:numPr>
             </w:pPr>
             <w:r>
@@ -9641,7 +10573,7 @@
               <w:pStyle w:val="Compact"/>
               <w:numPr>
                 <w:ilvl w:val="0"/>
-                <w:numId w:val="1023"/>
+                <w:numId w:val="1032"/>
               </w:numPr>
             </w:pPr>
             <w:r>
@@ -9661,7 +10593,7 @@
               <w:pStyle w:val="Compact"/>
               <w:numPr>
                 <w:ilvl w:val="0"/>
-                <w:numId w:val="1024"/>
+                <w:numId w:val="1033"/>
               </w:numPr>
             </w:pPr>
             <w:r>
@@ -9673,7 +10605,7 @@
               <w:pStyle w:val="Compact"/>
               <w:numPr>
                 <w:ilvl w:val="0"/>
-                <w:numId w:val="1024"/>
+                <w:numId w:val="1033"/>
               </w:numPr>
             </w:pPr>
             <w:r>
@@ -9802,8 +10734,8 @@
         </w:tc>
       </w:tr>
     </w:tbl>
-    <w:bookmarkEnd w:id="76"/>
-    <w:bookmarkStart w:id="88" w:name="感想"/>
+    <w:bookmarkEnd w:id="77"/>
+    <w:bookmarkStart w:id="89" w:name="感想"/>
     <w:p>
       <w:pPr>
         <w:pStyle w:val="Heading2"/>
@@ -9820,7 +10752,7 @@
         <w:pStyle w:val="Compact"/>
         <w:numPr>
           <w:ilvl w:val="0"/>
-          <w:numId w:val="1025"/>
+          <w:numId w:val="1034"/>
         </w:numPr>
       </w:pPr>
       <w:r>
@@ -9844,7 +10776,7 @@
         <w:pStyle w:val="Compact"/>
         <w:numPr>
           <w:ilvl w:val="0"/>
-          <w:numId w:val="1025"/>
+          <w:numId w:val="1034"/>
         </w:numPr>
       </w:pPr>
       <w:r>
@@ -9859,7 +10791,7 @@
         <w:pStyle w:val="Compact"/>
         <w:numPr>
           <w:ilvl w:val="0"/>
-          <w:numId w:val="1025"/>
+          <w:numId w:val="1034"/>
         </w:numPr>
       </w:pPr>
       <w:r>
@@ -9874,7 +10806,7 @@
         <w:pStyle w:val="Compact"/>
         <w:numPr>
           <w:ilvl w:val="0"/>
-          <w:numId w:val="1025"/>
+          <w:numId w:val="1034"/>
         </w:numPr>
       </w:pPr>
       <w:r>
@@ -9892,7 +10824,7 @@
         <w:pStyle w:val="Compact"/>
         <w:numPr>
           <w:ilvl w:val="0"/>
-          <w:numId w:val="1025"/>
+          <w:numId w:val="1034"/>
         </w:numPr>
       </w:pPr>
       <w:r>
@@ -9907,7 +10839,7 @@
         <w:pStyle w:val="Compact"/>
         <w:numPr>
           <w:ilvl w:val="0"/>
-          <w:numId w:val="1025"/>
+          <w:numId w:val="1034"/>
         </w:numPr>
       </w:pPr>
       <w:r>
@@ -9929,8 +10861,8 @@
         <w:t xml:space="preserve">competition以外あまりに制約をかけないので、推計精度が低い(技術の同質的な大標本が必要)かも</w:t>
       </w:r>
     </w:p>
-    <w:bookmarkStart w:id="87" w:name="refs"/>
-    <w:bookmarkStart w:id="78" w:name="ref-DeLoeckerEeckhoutUnger2020"/>
+    <w:bookmarkStart w:id="88" w:name="refs"/>
+    <w:bookmarkStart w:id="79" w:name="ref-DeLoeckerEeckhoutUnger2020"/>
     <w:p>
       <w:pPr>
         <w:pStyle w:val="Bibliography"/>
@@ -9963,7 +10895,7 @@
       <w:r>
         <w:t xml:space="preserve"> </w:t>
       </w:r>
-      <w:hyperlink r:id="rId77">
+      <w:hyperlink r:id="rId78">
         <w:r>
           <w:rPr>
             <w:rStyle w:val="Hyperlink"/>
@@ -9975,8 +10907,8 @@
         <w:t xml:space="preserve">.</w:t>
       </w:r>
     </w:p>
-    <w:bookmarkEnd w:id="78"/>
-    <w:bookmarkStart w:id="80" w:name="ref-HirshJahnManningOberfichtner2023"/>
+    <w:bookmarkEnd w:id="79"/>
+    <w:bookmarkStart w:id="81" w:name="ref-HirshJahnManningOberfichtner2023"/>
     <w:p>
       <w:pPr>
         <w:pStyle w:val="Bibliography"/>
@@ -9999,7 +10931,7 @@
       <w:r>
         <w:t xml:space="preserve"> </w:t>
       </w:r>
-      <w:hyperlink r:id="rId79">
+      <w:hyperlink r:id="rId80">
         <w:r>
           <w:rPr>
             <w:rStyle w:val="Hyperlink"/>
@@ -10011,8 +10943,8 @@
         <w:t xml:space="preserve">.</w:t>
       </w:r>
     </w:p>
-    <w:bookmarkEnd w:id="80"/>
-    <w:bookmarkStart w:id="82" w:name="ref-Mertens2022"/>
+    <w:bookmarkEnd w:id="81"/>
+    <w:bookmarkStart w:id="83" w:name="ref-Mertens2022"/>
     <w:p>
       <w:pPr>
         <w:pStyle w:val="Bibliography"/>
@@ -10045,7 +10977,7 @@
       <w:r>
         <w:t xml:space="preserve"> </w:t>
       </w:r>
-      <w:hyperlink r:id="rId81">
+      <w:hyperlink r:id="rId82">
         <w:r>
           <w:rPr>
             <w:rStyle w:val="Hyperlink"/>
@@ -10057,8 +10989,8 @@
         <w:t xml:space="preserve">.</w:t>
       </w:r>
     </w:p>
-    <w:bookmarkEnd w:id="82"/>
-    <w:bookmarkStart w:id="84" w:name="ref-Syverson2024"/>
+    <w:bookmarkEnd w:id="83"/>
+    <w:bookmarkStart w:id="85" w:name="ref-Syverson2024"/>
     <w:p>
       <w:pPr>
         <w:pStyle w:val="Bibliography"/>
@@ -10088,7 +11020,7 @@
       <w:r>
         <w:t xml:space="preserve"> </w:t>
       </w:r>
-      <w:hyperlink r:id="rId83">
+      <w:hyperlink r:id="rId84">
         <w:r>
           <w:rPr>
             <w:rStyle w:val="Hyperlink"/>
@@ -10100,8 +11032,8 @@
         <w:t xml:space="preserve">.</w:t>
       </w:r>
     </w:p>
-    <w:bookmarkEnd w:id="84"/>
-    <w:bookmarkStart w:id="86" w:name="ref-Treuren2022"/>
+    <w:bookmarkEnd w:id="85"/>
+    <w:bookmarkStart w:id="87" w:name="ref-Treuren2022"/>
     <w:p>
       <w:pPr>
         <w:pStyle w:val="Bibliography"/>
@@ -10131,7 +11063,7 @@
       <w:r>
         <w:t xml:space="preserve"> </w:t>
       </w:r>
-      <w:hyperlink r:id="rId85">
+      <w:hyperlink r:id="rId86">
         <w:r>
           <w:rPr>
             <w:rStyle w:val="Hyperlink"/>
@@ -10143,9 +11075,9 @@
         <w:t xml:space="preserve">.</w:t>
       </w:r>
     </w:p>
-    <w:bookmarkEnd w:id="86"/>
     <w:bookmarkEnd w:id="87"/>
     <w:bookmarkEnd w:id="88"/>
+    <w:bookmarkEnd w:id="89"/>
     <w:sectPr>
       <w:footnotePr>
         <w:numRestart w:val="eachSect"/>
@@ -10175,7 +11107,7 @@
       </w:r>
     </w:p>
   </w:footnote>
-  <w:footnote w:id="28">
+  <w:footnote w:id="29">
     <w:p>
       <w:pPr>
         <w:pStyle w:val="FootnoteText"/>
@@ -10197,7 +11129,7 @@
       </w:r>
     </w:p>
   </w:footnote>
-  <w:footnote w:id="29">
+  <w:footnote w:id="30">
     <w:p>
       <w:pPr>
         <w:pStyle w:val="FootnoteText"/>
@@ -10354,7 +11286,7 @@
       </w:r>
     </w:p>
   </w:footnote>
-  <w:footnote w:id="30">
+  <w:footnote w:id="31">
     <w:p>
       <w:pPr>
         <w:pStyle w:val="FootnoteText"/>
@@ -10517,7 +11449,7 @@
       </m:oMathPara>
     </w:p>
   </w:footnote>
-  <w:footnote w:id="31">
+  <w:footnote w:id="32">
     <w:p>
       <w:pPr>
         <w:pStyle w:val="FootnoteText"/>
@@ -11532,7 +12464,7 @@
       </m:oMathPara>
     </w:p>
   </w:footnote>
-  <w:footnote w:id="32">
+  <w:footnote w:id="33">
     <w:p>
       <w:pPr>
         <w:pStyle w:val="FootnoteText"/>
@@ -11750,7 +12682,7 @@
           <w:rPr>
             <w:rStyle w:val="Hyperlink"/>
           </w:rPr>
-          <w:t xml:space="preserve">Section 4</w:t>
+          <w:t xml:space="preserve">Section 5</w:t>
         </w:r>
       </w:hyperlink>
       <w:r>
@@ -11758,7 +12690,7 @@
       </w:r>
     </w:p>
   </w:footnote>
-  <w:footnote w:id="34">
+  <w:footnote w:id="35">
     <w:p>
       <w:pPr>
         <w:pStyle w:val="FootnoteText"/>
@@ -11911,7 +12843,7 @@
       </w:r>
     </w:p>
   </w:footnote>
-  <w:footnote w:id="35">
+  <w:footnote w:id="36">
     <w:p>
       <w:pPr>
         <w:pStyle w:val="FootnoteText"/>
@@ -11933,7 +12865,7 @@
       </w:r>
     </w:p>
   </w:footnote>
-  <w:footnote w:id="36">
+  <w:footnote w:id="37">
     <w:p>
       <w:pPr>
         <w:pStyle w:val="FootnoteText"/>
@@ -11955,7 +12887,7 @@
       </w:r>
     </w:p>
   </w:footnote>
-  <w:footnote w:id="37">
+  <w:footnote w:id="38">
     <w:p>
       <w:pPr>
         <w:pStyle w:val="FootnoteText"/>
@@ -12074,7 +13006,7 @@
       </w:r>
     </w:p>
   </w:footnote>
-  <w:footnote w:id="38">
+  <w:footnote w:id="39">
     <w:p>
       <w:pPr>
         <w:pStyle w:val="FootnoteText"/>
@@ -12266,7 +13198,7 @@
       </w:pPr>
     </w:p>
   </w:footnote>
-  <w:footnote w:id="43">
+  <w:footnote w:id="44">
     <w:p>
       <w:pPr>
         <w:pStyle w:val="FootnoteText"/>
@@ -12314,7 +13246,7 @@
       </w:r>
     </w:p>
   </w:footnote>
-  <w:footnote w:id="46">
+  <w:footnote w:id="47">
     <w:p>
       <w:pPr>
         <w:pStyle w:val="FootnoteText"/>
@@ -12539,7 +13471,7 @@
       </m:oMathPara>
     </w:p>
   </w:footnote>
-  <w:footnote w:id="49">
+  <w:footnote w:id="50">
     <w:p>
       <w:pPr>
         <w:pStyle w:val="FootnoteText"/>
@@ -12605,7 +13537,7 @@
       </w:r>
     </w:p>
   </w:footnote>
-  <w:footnote w:id="50">
+  <w:footnote w:id="51">
     <w:p>
       <w:pPr>
         <w:pStyle w:val="FootnoteText"/>
@@ -13040,7 +13972,7 @@
       </m:oMathPara>
     </w:p>
   </w:footnote>
-  <w:footnote w:id="51">
+  <w:footnote w:id="52">
     <w:p>
       <w:pPr>
         <w:pStyle w:val="FootnoteText"/>
@@ -13099,7 +14031,7 @@
       </w:r>
     </w:p>
   </w:footnote>
-  <w:footnote w:id="52">
+  <w:footnote w:id="53">
     <w:p>
       <w:pPr>
         <w:pStyle w:val="FootnoteText"/>
@@ -13620,7 +14552,7 @@
       </w:r>
     </w:p>
   </w:footnote>
-  <w:footnote w:id="53">
+  <w:footnote w:id="54">
     <w:p>
       <w:pPr>
         <w:pStyle w:val="FootnoteText"/>
@@ -14102,7 +15034,7 @@
       </m:oMathPara>
     </w:p>
   </w:footnote>
-  <w:footnote w:id="54">
+  <w:footnote w:id="55">
     <w:p>
       <w:pPr>
         <w:pStyle w:val="FootnoteText"/>
@@ -14402,7 +15334,7 @@
       </m:oMathPara>
     </w:p>
   </w:footnote>
-  <w:footnote w:id="55">
+  <w:footnote w:id="56">
     <w:p>
       <w:pPr>
         <w:pStyle w:val="FootnoteText"/>
@@ -14526,7 +15458,7 @@
       </w:r>
     </w:p>
   </w:footnote>
-  <w:footnote w:id="59">
+  <w:footnote w:id="60">
     <w:p>
       <w:pPr>
         <w:pStyle w:val="FootnoteText"/>
@@ -14649,7 +15581,7 @@
       </w:r>
     </w:p>
   </w:footnote>
-  <w:footnote w:id="60">
+  <w:footnote w:id="61">
     <w:p>
       <w:pPr>
         <w:pStyle w:val="FootnoteText"/>
@@ -14915,7 +15847,7 @@
       </w:r>
     </w:p>
   </w:footnote>
-  <w:footnote w:id="71">
+  <w:footnote w:id="72">
     <w:p>
       <w:pPr>
         <w:pStyle w:val="FootnoteText"/>
@@ -14982,7 +15914,7 @@
       </w:r>
     </w:p>
   </w:footnote>
-  <w:footnote w:id="72">
+  <w:footnote w:id="73">
     <w:p>
       <w:pPr>
         <w:pStyle w:val="FootnoteText"/>
@@ -15004,7 +15936,7 @@
       </w:r>
     </w:p>
   </w:footnote>
-  <w:footnote w:id="73">
+  <w:footnote w:id="74">
     <w:p>
       <w:pPr>
         <w:pStyle w:val="FootnoteText"/>
@@ -15026,7 +15958,7 @@
       </w:r>
     </w:p>
   </w:footnote>
-  <w:footnote w:id="74">
+  <w:footnote w:id="75">
     <w:p>
       <w:pPr>
         <w:pStyle w:val="FootnoteText"/>
@@ -15107,7 +16039,7 @@
       </w:r>
     </w:p>
   </w:footnote>
-  <w:footnote w:id="75">
+  <w:footnote w:id="76">
     <w:p>
       <w:pPr>
         <w:pStyle w:val="FootnoteText"/>
@@ -15646,6 +16578,33 @@
     <w:abstractNumId w:val="991"/>
   </w:num>
   <w:num w:numId="1012">
+    <w:abstractNumId w:val="991"/>
+  </w:num>
+  <w:num w:numId="1013">
+    <w:abstractNumId w:val="991"/>
+  </w:num>
+  <w:num w:numId="1014">
+    <w:abstractNumId w:val="991"/>
+  </w:num>
+  <w:num w:numId="1015">
+    <w:abstractNumId w:val="991"/>
+  </w:num>
+  <w:num w:numId="1016">
+    <w:abstractNumId w:val="991"/>
+  </w:num>
+  <w:num w:numId="1017">
+    <w:abstractNumId w:val="991"/>
+  </w:num>
+  <w:num w:numId="1018">
+    <w:abstractNumId w:val="991"/>
+  </w:num>
+  <w:num w:numId="1019">
+    <w:abstractNumId w:val="991"/>
+  </w:num>
+  <w:num w:numId="1020">
+    <w:abstractNumId w:val="991"/>
+  </w:num>
+  <w:num w:numId="1021">
     <w:abstractNumId w:val="99411"/>
     <w:lvlOverride w:ilvl="0">
       <w:startOverride w:val="1"/>
@@ -15675,33 +16634,6 @@
       <w:startOverride w:val="1"/>
     </w:lvlOverride>
   </w:num>
-  <w:num w:numId="1013">
-    <w:abstractNumId w:val="991"/>
-  </w:num>
-  <w:num w:numId="1014">
-    <w:abstractNumId w:val="991"/>
-  </w:num>
-  <w:num w:numId="1015">
-    <w:abstractNumId w:val="991"/>
-  </w:num>
-  <w:num w:numId="1016">
-    <w:abstractNumId w:val="991"/>
-  </w:num>
-  <w:num w:numId="1017">
-    <w:abstractNumId w:val="991"/>
-  </w:num>
-  <w:num w:numId="1018">
-    <w:abstractNumId w:val="991"/>
-  </w:num>
-  <w:num w:numId="1019">
-    <w:abstractNumId w:val="991"/>
-  </w:num>
-  <w:num w:numId="1020">
-    <w:abstractNumId w:val="991"/>
-  </w:num>
-  <w:num w:numId="1021">
-    <w:abstractNumId w:val="991"/>
-  </w:num>
   <w:num w:numId="1022">
     <w:abstractNumId w:val="991"/>
   </w:num>
@@ -15712,6 +16644,33 @@
     <w:abstractNumId w:val="991"/>
   </w:num>
   <w:num w:numId="1025">
+    <w:abstractNumId w:val="991"/>
+  </w:num>
+  <w:num w:numId="1026">
+    <w:abstractNumId w:val="991"/>
+  </w:num>
+  <w:num w:numId="1027">
+    <w:abstractNumId w:val="991"/>
+  </w:num>
+  <w:num w:numId="1028">
+    <w:abstractNumId w:val="991"/>
+  </w:num>
+  <w:num w:numId="1029">
+    <w:abstractNumId w:val="991"/>
+  </w:num>
+  <w:num w:numId="1030">
+    <w:abstractNumId w:val="991"/>
+  </w:num>
+  <w:num w:numId="1031">
+    <w:abstractNumId w:val="991"/>
+  </w:num>
+  <w:num w:numId="1032">
+    <w:abstractNumId w:val="991"/>
+  </w:num>
+  <w:num w:numId="1033">
+    <w:abstractNumId w:val="991"/>
+  </w:num>
+  <w:num w:numId="1034">
     <w:abstractNumId w:val="991"/>
   </w:num>
 </w:numbering>

</xml_diff>